<commit_message>
docs: clarify three-student team positioning
</commit_message>
<xml_diff>
--- a/output/docx/AI产品开发引擎技术白皮书.docx
+++ b/output/docx/AI产品开发引擎技术白皮书.docx
@@ -39,7 +39,7 @@
           <w:color w:val="9A6A00"/>
           <w:sz w:val="20"/>
         </w:rPr>
-        <w:t>TECHNICAL WHITE PAPER · 竞赛评审版</w:t>
+        <w:t>TECHNICAL WHITE PAPER · 企业级赛题评审版</w:t>
       </w:r>
     </w:p>
     <w:p>
@@ -108,7 +108,7 @@
           <w:color w:val="667085"/>
           <w:sz w:val="20"/>
         </w:rPr>
-        <w:t>v1.0</w:t>
+        <w:t>v1.1</w:t>
       </w:r>
     </w:p>
     <w:p>
@@ -146,7 +146,7 @@
           <w:color w:val="667085"/>
           <w:sz w:val="20"/>
         </w:rPr>
-        <w:t xml:space="preserve">证据口径  ·  </w:t>
+        <w:t xml:space="preserve">参赛团队  ·  </w:t>
       </w:r>
       <w:r>
         <w:rPr>
@@ -154,7 +154,7 @@
           <w:color w:val="667085"/>
           <w:sz w:val="20"/>
         </w:rPr>
-        <w:t>实现 / 合成演示 / 企业待验证</w:t>
+        <w:t>三名学生</w:t>
       </w:r>
     </w:p>
     <w:p>
@@ -169,6 +169,52 @@
           <w:color w:val="667085"/>
           <w:sz w:val="20"/>
         </w:rPr>
+        <w:t xml:space="preserve">项目定位  ·  </w:t>
+      </w:r>
+      <w:r>
+        <w:rPr>
+          <w:rFonts w:ascii="Calibri" w:hAnsi="Calibri" w:eastAsia="Microsoft YaHei"/>
+          <w:color w:val="667085"/>
+          <w:sz w:val="20"/>
+        </w:rPr>
+        <w:t>企业级赛题原型 · 非企业内部生产项目</w:t>
+      </w:r>
+    </w:p>
+    <w:p>
+      <w:pPr>
+        <w:spacing w:after="80"/>
+        <w:jc w:val="center"/>
+      </w:pPr>
+      <w:r>
+        <w:rPr>
+          <w:rFonts w:ascii="Calibri" w:hAnsi="Calibri" w:eastAsia="Microsoft YaHei"/>
+          <w:b/>
+          <w:color w:val="667085"/>
+          <w:sz w:val="20"/>
+        </w:rPr>
+        <w:t xml:space="preserve">证据口径  ·  </w:t>
+      </w:r>
+      <w:r>
+        <w:rPr>
+          <w:rFonts w:ascii="Calibri" w:hAnsi="Calibri" w:eastAsia="Microsoft YaHei"/>
+          <w:color w:val="667085"/>
+          <w:sz w:val="20"/>
+        </w:rPr>
+        <w:t>实现 / 合成演示 / 企业待验证</w:t>
+      </w:r>
+    </w:p>
+    <w:p>
+      <w:pPr>
+        <w:spacing w:after="80"/>
+        <w:jc w:val="center"/>
+      </w:pPr>
+      <w:r>
+        <w:rPr>
+          <w:rFonts w:ascii="Calibri" w:hAnsi="Calibri" w:eastAsia="Microsoft YaHei"/>
+          <w:b/>
+          <w:color w:val="667085"/>
+          <w:sz w:val="20"/>
+        </w:rPr>
         <w:t xml:space="preserve">代码仓库  ·  </w:t>
       </w:r>
       <w:r>
@@ -211,8 +257,8 @@
     </w:p>
     <w:p>
       <w:pPr>
-        <w:pStyle w:val="ListNumber"/>
-        <w:spacing w:after="60"/>
+        <w:spacing w:after="60" w:line="280" w:lineRule="auto"/>
+        <w:ind w:left="720" w:hanging="360"/>
         <w:numPr>
           <w:ilvl w:val="0"/>
           <w:numId w:val="10"/>
@@ -229,8 +275,8 @@
     </w:p>
     <w:p>
       <w:pPr>
-        <w:pStyle w:val="ListNumber"/>
-        <w:spacing w:after="60"/>
+        <w:spacing w:after="60" w:line="280" w:lineRule="auto"/>
+        <w:ind w:left="720" w:hanging="360"/>
         <w:numPr>
           <w:ilvl w:val="0"/>
           <w:numId w:val="10"/>
@@ -247,8 +293,8 @@
     </w:p>
     <w:p>
       <w:pPr>
-        <w:pStyle w:val="ListNumber"/>
-        <w:spacing w:after="60"/>
+        <w:spacing w:after="60" w:line="280" w:lineRule="auto"/>
+        <w:ind w:left="720" w:hanging="360"/>
         <w:numPr>
           <w:ilvl w:val="0"/>
           <w:numId w:val="10"/>
@@ -265,8 +311,8 @@
     </w:p>
     <w:p>
       <w:pPr>
-        <w:pStyle w:val="ListNumber"/>
-        <w:spacing w:after="60"/>
+        <w:spacing w:after="60" w:line="280" w:lineRule="auto"/>
+        <w:ind w:left="720" w:hanging="360"/>
         <w:numPr>
           <w:ilvl w:val="0"/>
           <w:numId w:val="10"/>
@@ -283,8 +329,8 @@
     </w:p>
     <w:p>
       <w:pPr>
-        <w:pStyle w:val="ListNumber"/>
-        <w:spacing w:after="60"/>
+        <w:spacing w:after="60" w:line="280" w:lineRule="auto"/>
+        <w:ind w:left="720" w:hanging="360"/>
         <w:numPr>
           <w:ilvl w:val="0"/>
           <w:numId w:val="10"/>
@@ -301,8 +347,8 @@
     </w:p>
     <w:p>
       <w:pPr>
-        <w:pStyle w:val="ListNumber"/>
-        <w:spacing w:after="60"/>
+        <w:spacing w:after="60" w:line="280" w:lineRule="auto"/>
+        <w:ind w:left="720" w:hanging="360"/>
         <w:numPr>
           <w:ilvl w:val="0"/>
           <w:numId w:val="10"/>
@@ -319,8 +365,8 @@
     </w:p>
     <w:p>
       <w:pPr>
-        <w:pStyle w:val="ListNumber"/>
-        <w:spacing w:after="60"/>
+        <w:spacing w:after="60" w:line="280" w:lineRule="auto"/>
+        <w:ind w:left="720" w:hanging="360"/>
         <w:numPr>
           <w:ilvl w:val="0"/>
           <w:numId w:val="10"/>
@@ -337,8 +383,8 @@
     </w:p>
     <w:p>
       <w:pPr>
-        <w:pStyle w:val="ListNumber"/>
-        <w:spacing w:after="60"/>
+        <w:spacing w:after="60" w:line="280" w:lineRule="auto"/>
+        <w:ind w:left="720" w:hanging="360"/>
         <w:numPr>
           <w:ilvl w:val="0"/>
           <w:numId w:val="10"/>
@@ -355,8 +401,8 @@
     </w:p>
     <w:p>
       <w:pPr>
-        <w:pStyle w:val="ListNumber"/>
-        <w:spacing w:after="60"/>
+        <w:spacing w:after="60" w:line="280" w:lineRule="auto"/>
+        <w:ind w:left="720" w:hanging="360"/>
         <w:numPr>
           <w:ilvl w:val="0"/>
           <w:numId w:val="10"/>
@@ -373,8 +419,8 @@
     </w:p>
     <w:p>
       <w:pPr>
-        <w:pStyle w:val="ListNumber"/>
-        <w:spacing w:after="60"/>
+        <w:spacing w:after="60" w:line="280" w:lineRule="auto"/>
+        <w:ind w:left="720" w:hanging="360"/>
         <w:numPr>
           <w:ilvl w:val="0"/>
           <w:numId w:val="10"/>
@@ -391,8 +437,8 @@
     </w:p>
     <w:p>
       <w:pPr>
-        <w:pStyle w:val="ListNumber"/>
-        <w:spacing w:after="60"/>
+        <w:spacing w:after="60" w:line="280" w:lineRule="auto"/>
+        <w:ind w:left="720" w:hanging="360"/>
         <w:numPr>
           <w:ilvl w:val="0"/>
           <w:numId w:val="10"/>
@@ -409,8 +455,8 @@
     </w:p>
     <w:p>
       <w:pPr>
-        <w:pStyle w:val="ListNumber"/>
-        <w:spacing w:after="60"/>
+        <w:spacing w:after="60" w:line="280" w:lineRule="auto"/>
+        <w:ind w:left="720" w:hanging="360"/>
         <w:numPr>
           <w:ilvl w:val="0"/>
           <w:numId w:val="10"/>
@@ -427,8 +473,8 @@
     </w:p>
     <w:p>
       <w:pPr>
-        <w:pStyle w:val="ListNumber"/>
-        <w:spacing w:after="60"/>
+        <w:spacing w:after="60" w:line="280" w:lineRule="auto"/>
+        <w:ind w:left="720" w:hanging="360"/>
         <w:numPr>
           <w:ilvl w:val="0"/>
           <w:numId w:val="10"/>
@@ -445,8 +491,8 @@
     </w:p>
     <w:p>
       <w:pPr>
-        <w:pStyle w:val="ListNumber"/>
-        <w:spacing w:after="60"/>
+        <w:spacing w:after="60" w:line="280" w:lineRule="auto"/>
+        <w:ind w:left="720" w:hanging="360"/>
         <w:numPr>
           <w:ilvl w:val="0"/>
           <w:numId w:val="10"/>
@@ -463,8 +509,8 @@
     </w:p>
     <w:p>
       <w:pPr>
-        <w:pStyle w:val="ListNumber"/>
-        <w:spacing w:after="60"/>
+        <w:spacing w:after="60" w:line="280" w:lineRule="auto"/>
+        <w:ind w:left="720" w:hanging="360"/>
         <w:numPr>
           <w:ilvl w:val="0"/>
           <w:numId w:val="10"/>
@@ -525,6 +571,7 @@
     <w:p>
       <w:pPr>
         <w:pStyle w:val="Heading1"/>
+        <w:ind w:left="0" w:right="0" w:firstLine="0"/>
       </w:pPr>
       <w:r>
         <w:rPr>
@@ -589,7 +636,7 @@
           <w:color w:val="222222"/>
           <w:sz w:val="22"/>
         </w:rPr>
-        <w:t>本项目的当前证据分为三级：核心算法与防泄漏控制已实现并通过自动化测试；端到端指标来自固定生成器的合成演示；真实爆品命中率、周期、成本和 ROI 仍需企业历史数据回放与前瞻试点验证。本文不把合成结果描述为生产业绩。</w:t>
+        <w:t>本项目由三名学生组成的参赛团队独立完成，目标是按企业级赛题和交付标准构建可验证原型，不代表名创优品内部项目或已上线系统。当前证据分为三级：核心算法与防泄漏控制已实现并通过自动化测试；端到端指标来自固定生成器的合成演示；真实爆品命中率、周期、成本和 ROI 仍需企业历史数据回放与前瞻试点验证。本文不把合成结果描述为生产业绩。</w:t>
       </w:r>
     </w:p>
     <w:p>
@@ -617,6 +664,7 @@
     <w:p>
       <w:pPr>
         <w:pStyle w:val="Heading1"/>
+        <w:ind w:left="0" w:right="0" w:firstLine="0"/>
       </w:pPr>
       <w:r>
         <w:rPr>
@@ -631,6 +679,7 @@
     <w:p>
       <w:pPr>
         <w:pStyle w:val="Heading2"/>
+        <w:ind w:left="0" w:right="0" w:firstLine="0"/>
       </w:pPr>
       <w:r>
         <w:rPr>
@@ -657,7 +706,8 @@
     </w:p>
     <w:p>
       <w:pPr>
-        <w:pStyle w:val="ListNumber"/>
+        <w:spacing w:after="160" w:line="280" w:lineRule="auto"/>
+        <w:ind w:left="720" w:hanging="360"/>
         <w:numPr>
           <w:ilvl w:val="0"/>
           <w:numId w:val="11"/>
@@ -683,7 +733,8 @@
     </w:p>
     <w:p>
       <w:pPr>
-        <w:pStyle w:val="ListNumber"/>
+        <w:spacing w:after="160" w:line="280" w:lineRule="auto"/>
+        <w:ind w:left="720" w:hanging="360"/>
         <w:numPr>
           <w:ilvl w:val="0"/>
           <w:numId w:val="11"/>
@@ -709,7 +760,8 @@
     </w:p>
     <w:p>
       <w:pPr>
-        <w:pStyle w:val="ListNumber"/>
+        <w:spacing w:after="160" w:line="280" w:lineRule="auto"/>
+        <w:ind w:left="720" w:hanging="360"/>
         <w:numPr>
           <w:ilvl w:val="0"/>
           <w:numId w:val="11"/>
@@ -735,7 +787,8 @@
     </w:p>
     <w:p>
       <w:pPr>
-        <w:pStyle w:val="ListNumber"/>
+        <w:spacing w:after="160" w:line="280" w:lineRule="auto"/>
+        <w:ind w:left="720" w:hanging="360"/>
         <w:numPr>
           <w:ilvl w:val="0"/>
           <w:numId w:val="11"/>
@@ -762,6 +815,7 @@
     <w:p>
       <w:pPr>
         <w:pStyle w:val="Heading2"/>
+        <w:ind w:left="0" w:right="0" w:firstLine="0"/>
       </w:pPr>
       <w:r>
         <w:rPr>
@@ -867,6 +921,7 @@
     <w:p>
       <w:pPr>
         <w:pStyle w:val="Heading2"/>
+        <w:ind w:left="0" w:right="0" w:firstLine="0"/>
       </w:pPr>
       <w:r>
         <w:rPr>
@@ -876,6 +931,19 @@
           <w:sz w:val="26"/>
         </w:rPr>
         <w:t>1.3 当前交付状态</w:t>
+      </w:r>
+    </w:p>
+    <w:p>
+      <w:pPr>
+        <w:keepNext w:val="0"/>
+      </w:pPr>
+      <w:r>
+        <w:rPr>
+          <w:rFonts w:ascii="Calibri" w:hAnsi="Calibri" w:eastAsia="Microsoft YaHei"/>
+          <w:color w:val="222222"/>
+          <w:sz w:val="22"/>
+        </w:rPr>
+        <w:t>以下成果由三名学生组成的参赛团队完成。表中的“企业待验证”表示需要企业数据、领域专家或真实应用环境才能继续验证，并不暗示这些条件已经具备。</w:t>
       </w:r>
     </w:p>
     <w:tbl>
@@ -1680,6 +1748,7 @@
     <w:p>
       <w:pPr>
         <w:pStyle w:val="Heading1"/>
+        <w:ind w:left="0" w:right="0" w:firstLine="0"/>
       </w:pPr>
       <w:r>
         <w:rPr>
@@ -1694,6 +1763,7 @@
     <w:p>
       <w:pPr>
         <w:pStyle w:val="Heading2"/>
+        <w:ind w:left="0" w:right="0" w:firstLine="0"/>
       </w:pPr>
       <w:r>
         <w:rPr>
@@ -1840,6 +1910,7 @@
     <w:p>
       <w:pPr>
         <w:pStyle w:val="Heading2"/>
+        <w:ind w:left="0" w:right="0" w:firstLine="0"/>
       </w:pPr>
       <w:r>
         <w:rPr>
@@ -1932,6 +2003,7 @@
     <w:p>
       <w:pPr>
         <w:pStyle w:val="Heading1"/>
+        <w:ind w:left="0" w:right="0" w:firstLine="0"/>
       </w:pPr>
       <w:r>
         <w:rPr>
@@ -1946,6 +2018,7 @@
     <w:p>
       <w:pPr>
         <w:pStyle w:val="Heading2"/>
+        <w:ind w:left="0" w:right="0" w:firstLine="0"/>
       </w:pPr>
       <w:r>
         <w:rPr>
@@ -2015,6 +2088,7 @@
     <w:p>
       <w:pPr>
         <w:pStyle w:val="Heading2"/>
+        <w:ind w:left="0" w:right="0" w:firstLine="0"/>
       </w:pPr>
       <w:r>
         <w:rPr>
@@ -2042,6 +2116,7 @@
     <w:p>
       <w:pPr>
         <w:pStyle w:val="Heading2"/>
+        <w:ind w:left="0" w:right="0" w:firstLine="0"/>
       </w:pPr>
       <w:r>
         <w:rPr>
@@ -2165,6 +2240,7 @@
     <w:p>
       <w:pPr>
         <w:pStyle w:val="Heading1"/>
+        <w:ind w:left="0" w:right="0" w:firstLine="0"/>
       </w:pPr>
       <w:r>
         <w:rPr>
@@ -2179,6 +2255,7 @@
     <w:p>
       <w:pPr>
         <w:pStyle w:val="Heading2"/>
+        <w:ind w:left="0" w:right="0" w:firstLine="0"/>
       </w:pPr>
       <w:r>
         <w:rPr>
@@ -2336,6 +2413,7 @@
     <w:p>
       <w:pPr>
         <w:pStyle w:val="Heading2"/>
+        <w:ind w:left="0" w:right="0" w:firstLine="0"/>
       </w:pPr>
       <w:r>
         <w:rPr>
@@ -3274,6 +3352,7 @@
     <w:p>
       <w:pPr>
         <w:pStyle w:val="Heading2"/>
+        <w:ind w:left="0" w:right="0" w:firstLine="0"/>
       </w:pPr>
       <w:r>
         <w:rPr>
@@ -3430,6 +3509,7 @@
     <w:p>
       <w:pPr>
         <w:pStyle w:val="Heading2"/>
+        <w:ind w:left="0" w:right="0" w:firstLine="0"/>
       </w:pPr>
       <w:r>
         <w:rPr>
@@ -3457,6 +3537,7 @@
     <w:p>
       <w:pPr>
         <w:pStyle w:val="Heading1"/>
+        <w:ind w:left="0" w:right="0" w:firstLine="0"/>
       </w:pPr>
       <w:r>
         <w:rPr>
@@ -3471,6 +3552,7 @@
     <w:p>
       <w:pPr>
         <w:pStyle w:val="Heading2"/>
+        <w:ind w:left="0" w:right="0" w:firstLine="0"/>
       </w:pPr>
       <w:r>
         <w:rPr>
@@ -3498,6 +3580,7 @@
     <w:p>
       <w:pPr>
         <w:pStyle w:val="Heading2"/>
+        <w:ind w:left="0" w:right="0" w:firstLine="0"/>
       </w:pPr>
       <w:r>
         <w:rPr>
@@ -3600,6 +3683,7 @@
     <w:p>
       <w:pPr>
         <w:pStyle w:val="Heading2"/>
+        <w:ind w:left="0" w:right="0" w:firstLine="0"/>
       </w:pPr>
       <w:r>
         <w:rPr>
@@ -3659,6 +3743,7 @@
     <w:p>
       <w:pPr>
         <w:pStyle w:val="Heading2"/>
+        <w:ind w:left="0" w:right="0" w:firstLine="0"/>
       </w:pPr>
       <w:r>
         <w:rPr>
@@ -3686,6 +3771,7 @@
     <w:p>
       <w:pPr>
         <w:pStyle w:val="Heading1"/>
+        <w:ind w:left="0" w:right="0" w:firstLine="0"/>
       </w:pPr>
       <w:r>
         <w:rPr>
@@ -3700,6 +3786,7 @@
     <w:p>
       <w:pPr>
         <w:pStyle w:val="Heading2"/>
+        <w:ind w:left="0" w:right="0" w:firstLine="0"/>
       </w:pPr>
       <w:r>
         <w:rPr>
@@ -3756,6 +3843,7 @@
     <w:p>
       <w:pPr>
         <w:pStyle w:val="Heading2"/>
+        <w:ind w:left="0" w:right="0" w:firstLine="0"/>
       </w:pPr>
       <w:r>
         <w:rPr>
@@ -3874,6 +3962,7 @@
     <w:p>
       <w:pPr>
         <w:pStyle w:val="Heading2"/>
+        <w:ind w:left="0" w:right="0" w:firstLine="0"/>
       </w:pPr>
       <w:r>
         <w:rPr>
@@ -3901,6 +3990,7 @@
     <w:p>
       <w:pPr>
         <w:pStyle w:val="Heading1"/>
+        <w:ind w:left="0" w:right="0" w:firstLine="0"/>
       </w:pPr>
       <w:r>
         <w:rPr>
@@ -3915,6 +4005,7 @@
     <w:p>
       <w:pPr>
         <w:pStyle w:val="Heading2"/>
+        <w:ind w:left="0" w:right="0" w:firstLine="0"/>
       </w:pPr>
       <w:r>
         <w:rPr>
@@ -3988,6 +4079,7 @@
     <w:p>
       <w:pPr>
         <w:pStyle w:val="Heading2"/>
+        <w:ind w:left="0" w:right="0" w:firstLine="0"/>
       </w:pPr>
       <w:r>
         <w:rPr>
@@ -4067,6 +4159,7 @@
     <w:p>
       <w:pPr>
         <w:pStyle w:val="Heading2"/>
+        <w:ind w:left="0" w:right="0" w:firstLine="0"/>
       </w:pPr>
       <w:r>
         <w:rPr>
@@ -4124,6 +4217,7 @@
     <w:p>
       <w:pPr>
         <w:pStyle w:val="Heading2"/>
+        <w:ind w:left="0" w:right="0" w:firstLine="0"/>
       </w:pPr>
       <w:r>
         <w:rPr>
@@ -4151,6 +4245,7 @@
     <w:p>
       <w:pPr>
         <w:pStyle w:val="Heading1"/>
+        <w:ind w:left="0" w:right="0" w:firstLine="0"/>
       </w:pPr>
       <w:r>
         <w:rPr>
@@ -4165,6 +4260,7 @@
     <w:p>
       <w:pPr>
         <w:pStyle w:val="Heading2"/>
+        <w:ind w:left="0" w:right="0" w:firstLine="0"/>
       </w:pPr>
       <w:r>
         <w:rPr>
@@ -4192,6 +4288,7 @@
     <w:p>
       <w:pPr>
         <w:pStyle w:val="Heading2"/>
+        <w:ind w:left="0" w:right="0" w:firstLine="0"/>
       </w:pPr>
       <w:r>
         <w:rPr>
@@ -4282,6 +4379,7 @@
     <w:p>
       <w:pPr>
         <w:pStyle w:val="Heading2"/>
+        <w:ind w:left="0" w:right="0" w:firstLine="0"/>
       </w:pPr>
       <w:r>
         <w:rPr>
@@ -4359,6 +4457,7 @@
     <w:p>
       <w:pPr>
         <w:pStyle w:val="Heading2"/>
+        <w:ind w:left="0" w:right="0" w:firstLine="0"/>
       </w:pPr>
       <w:r>
         <w:rPr>
@@ -4447,6 +4546,7 @@
     <w:p>
       <w:pPr>
         <w:pStyle w:val="Heading2"/>
+        <w:ind w:left="0" w:right="0" w:firstLine="0"/>
       </w:pPr>
       <w:r>
         <w:rPr>
@@ -4503,6 +4603,7 @@
     <w:p>
       <w:pPr>
         <w:pStyle w:val="Heading1"/>
+        <w:ind w:left="0" w:right="0" w:firstLine="0"/>
       </w:pPr>
       <w:r>
         <w:rPr>
@@ -4517,6 +4618,7 @@
     <w:p>
       <w:pPr>
         <w:pStyle w:val="Heading2"/>
+        <w:ind w:left="0" w:right="0" w:firstLine="0"/>
       </w:pPr>
       <w:r>
         <w:rPr>
@@ -4630,6 +4732,7 @@
     <w:p>
       <w:pPr>
         <w:pStyle w:val="Heading2"/>
+        <w:ind w:left="0" w:right="0" w:firstLine="0"/>
       </w:pPr>
       <w:r>
         <w:rPr>
@@ -4673,6 +4776,7 @@
     <w:p>
       <w:pPr>
         <w:pStyle w:val="Heading2"/>
+        <w:ind w:left="0" w:right="0" w:firstLine="0"/>
       </w:pPr>
       <w:r>
         <w:rPr>
@@ -4686,7 +4790,8 @@
     </w:p>
     <w:p>
       <w:pPr>
-        <w:pStyle w:val="ListNumber"/>
+        <w:spacing w:after="160" w:line="280" w:lineRule="auto"/>
+        <w:ind w:left="720" w:hanging="360"/>
         <w:numPr>
           <w:ilvl w:val="0"/>
           <w:numId w:val="12"/>
@@ -4712,7 +4817,8 @@
     </w:p>
     <w:p>
       <w:pPr>
-        <w:pStyle w:val="ListNumber"/>
+        <w:spacing w:after="160" w:line="280" w:lineRule="auto"/>
+        <w:ind w:left="720" w:hanging="360"/>
         <w:numPr>
           <w:ilvl w:val="0"/>
           <w:numId w:val="12"/>
@@ -4738,7 +4844,8 @@
     </w:p>
     <w:p>
       <w:pPr>
-        <w:pStyle w:val="ListNumber"/>
+        <w:spacing w:after="160" w:line="280" w:lineRule="auto"/>
+        <w:ind w:left="720" w:hanging="360"/>
         <w:numPr>
           <w:ilvl w:val="0"/>
           <w:numId w:val="12"/>
@@ -4778,6 +4885,7 @@
     <w:p>
       <w:pPr>
         <w:pStyle w:val="Heading2"/>
+        <w:ind w:left="0" w:right="0" w:firstLine="0"/>
       </w:pPr>
       <w:r>
         <w:rPr>
@@ -4840,6 +4948,7 @@
     <w:p>
       <w:pPr>
         <w:pStyle w:val="Heading2"/>
+        <w:ind w:left="0" w:right="0" w:firstLine="0"/>
       </w:pPr>
       <w:r>
         <w:rPr>
@@ -5470,6 +5579,7 @@
     <w:p>
       <w:pPr>
         <w:pStyle w:val="Heading2"/>
+        <w:ind w:left="0" w:right="0" w:firstLine="0"/>
       </w:pPr>
       <w:r>
         <w:rPr>
@@ -5497,6 +5607,7 @@
     <w:p>
       <w:pPr>
         <w:pStyle w:val="Heading1"/>
+        <w:ind w:left="0" w:right="0" w:firstLine="0"/>
       </w:pPr>
       <w:r>
         <w:rPr>
@@ -5511,6 +5622,7 @@
     <w:p>
       <w:pPr>
         <w:pStyle w:val="Heading2"/>
+        <w:ind w:left="0" w:right="0" w:firstLine="0"/>
       </w:pPr>
       <w:r>
         <w:rPr>
@@ -5974,6 +6086,7 @@
     <w:p>
       <w:pPr>
         <w:pStyle w:val="Heading2"/>
+        <w:ind w:left="0" w:right="0" w:firstLine="0"/>
       </w:pPr>
       <w:r>
         <w:rPr>
@@ -6014,6 +6127,7 @@
     <w:p>
       <w:pPr>
         <w:pStyle w:val="Heading2"/>
+        <w:ind w:left="0" w:right="0" w:firstLine="0"/>
       </w:pPr>
       <w:r>
         <w:rPr>
@@ -6132,6 +6246,7 @@
     <w:p>
       <w:pPr>
         <w:pStyle w:val="Heading2"/>
+        <w:ind w:left="0" w:right="0" w:firstLine="0"/>
       </w:pPr>
       <w:r>
         <w:rPr>
@@ -6159,6 +6274,7 @@
     <w:p>
       <w:pPr>
         <w:pStyle w:val="Heading1"/>
+        <w:ind w:left="0" w:right="0" w:firstLine="0"/>
       </w:pPr>
       <w:r>
         <w:rPr>
@@ -6173,6 +6289,7 @@
     <w:p>
       <w:pPr>
         <w:pStyle w:val="Heading2"/>
+        <w:ind w:left="0" w:right="0" w:firstLine="0"/>
       </w:pPr>
       <w:r>
         <w:rPr>
@@ -6200,6 +6317,7 @@
     <w:p>
       <w:pPr>
         <w:pStyle w:val="Heading2"/>
+        <w:ind w:left="0" w:right="0" w:firstLine="0"/>
       </w:pPr>
       <w:r>
         <w:rPr>
@@ -6708,6 +6826,7 @@
     <w:p>
       <w:pPr>
         <w:pStyle w:val="Heading2"/>
+        <w:ind w:left="0" w:right="0" w:firstLine="0"/>
       </w:pPr>
       <w:r>
         <w:rPr>
@@ -6735,6 +6854,7 @@
     <w:p>
       <w:pPr>
         <w:pStyle w:val="Heading2"/>
+        <w:ind w:left="0" w:right="0" w:firstLine="0"/>
       </w:pPr>
       <w:r>
         <w:rPr>
@@ -6762,6 +6882,7 @@
     <w:p>
       <w:pPr>
         <w:pStyle w:val="Heading1"/>
+        <w:ind w:left="0" w:right="0" w:firstLine="0"/>
       </w:pPr>
       <w:r>
         <w:rPr>
@@ -6776,6 +6897,7 @@
     <w:p>
       <w:pPr>
         <w:pStyle w:val="Heading2"/>
+        <w:ind w:left="0" w:right="0" w:firstLine="0"/>
       </w:pPr>
       <w:r>
         <w:rPr>
@@ -6803,6 +6925,7 @@
     <w:p>
       <w:pPr>
         <w:pStyle w:val="Heading2"/>
+        <w:ind w:left="0" w:right="0" w:firstLine="0"/>
       </w:pPr>
       <w:r>
         <w:rPr>
@@ -6830,6 +6953,7 @@
     <w:p>
       <w:pPr>
         <w:pStyle w:val="Heading2"/>
+        <w:ind w:left="0" w:right="0" w:firstLine="0"/>
       </w:pPr>
       <w:r>
         <w:rPr>
@@ -6857,6 +6981,7 @@
     <w:p>
       <w:pPr>
         <w:pStyle w:val="Heading2"/>
+        <w:ind w:left="0" w:right="0" w:firstLine="0"/>
       </w:pPr>
       <w:r>
         <w:rPr>
@@ -6884,6 +7009,7 @@
     <w:p>
       <w:pPr>
         <w:pStyle w:val="Heading2"/>
+        <w:ind w:left="0" w:right="0" w:firstLine="0"/>
       </w:pPr>
       <w:r>
         <w:rPr>
@@ -7030,6 +7156,7 @@
     <w:p>
       <w:pPr>
         <w:pStyle w:val="Heading1"/>
+        <w:ind w:left="0" w:right="0" w:firstLine="0"/>
       </w:pPr>
       <w:r>
         <w:rPr>
@@ -7044,6 +7171,7 @@
     <w:p>
       <w:pPr>
         <w:pStyle w:val="Heading2"/>
+        <w:ind w:left="0" w:right="0" w:firstLine="0"/>
       </w:pPr>
       <w:r>
         <w:rPr>
@@ -7057,7 +7185,8 @@
     </w:p>
     <w:p>
       <w:pPr>
-        <w:pStyle w:val="ListNumber"/>
+        <w:spacing w:after="160" w:line="280" w:lineRule="auto"/>
+        <w:ind w:left="720" w:hanging="360"/>
         <w:numPr>
           <w:ilvl w:val="0"/>
           <w:numId w:val="13"/>
@@ -7074,7 +7203,8 @@
     </w:p>
     <w:p>
       <w:pPr>
-        <w:pStyle w:val="ListNumber"/>
+        <w:spacing w:after="160" w:line="280" w:lineRule="auto"/>
+        <w:ind w:left="720" w:hanging="360"/>
         <w:numPr>
           <w:ilvl w:val="0"/>
           <w:numId w:val="13"/>
@@ -7091,7 +7221,8 @@
     </w:p>
     <w:p>
       <w:pPr>
-        <w:pStyle w:val="ListNumber"/>
+        <w:spacing w:after="160" w:line="280" w:lineRule="auto"/>
+        <w:ind w:left="720" w:hanging="360"/>
         <w:numPr>
           <w:ilvl w:val="0"/>
           <w:numId w:val="13"/>
@@ -7108,7 +7239,8 @@
     </w:p>
     <w:p>
       <w:pPr>
-        <w:pStyle w:val="ListNumber"/>
+        <w:spacing w:after="160" w:line="280" w:lineRule="auto"/>
+        <w:ind w:left="720" w:hanging="360"/>
         <w:numPr>
           <w:ilvl w:val="0"/>
           <w:numId w:val="13"/>
@@ -7125,7 +7257,8 @@
     </w:p>
     <w:p>
       <w:pPr>
-        <w:pStyle w:val="ListNumber"/>
+        <w:spacing w:after="160" w:line="280" w:lineRule="auto"/>
+        <w:ind w:left="720" w:hanging="360"/>
         <w:numPr>
           <w:ilvl w:val="0"/>
           <w:numId w:val="13"/>
@@ -7142,7 +7275,8 @@
     </w:p>
     <w:p>
       <w:pPr>
-        <w:pStyle w:val="ListNumber"/>
+        <w:spacing w:after="160" w:line="280" w:lineRule="auto"/>
+        <w:ind w:left="720" w:hanging="360"/>
         <w:numPr>
           <w:ilvl w:val="0"/>
           <w:numId w:val="13"/>
@@ -7159,7 +7293,8 @@
     </w:p>
     <w:p>
       <w:pPr>
-        <w:pStyle w:val="ListNumber"/>
+        <w:spacing w:after="160" w:line="280" w:lineRule="auto"/>
+        <w:ind w:left="720" w:hanging="360"/>
         <w:numPr>
           <w:ilvl w:val="0"/>
           <w:numId w:val="13"/>
@@ -7176,7 +7311,8 @@
     </w:p>
     <w:p>
       <w:pPr>
-        <w:pStyle w:val="ListNumber"/>
+        <w:spacing w:after="160" w:line="280" w:lineRule="auto"/>
+        <w:ind w:left="720" w:hanging="360"/>
         <w:numPr>
           <w:ilvl w:val="0"/>
           <w:numId w:val="13"/>
@@ -7194,6 +7330,7 @@
     <w:p>
       <w:pPr>
         <w:pStyle w:val="Heading2"/>
+        <w:ind w:left="0" w:right="0" w:firstLine="0"/>
       </w:pPr>
       <w:r>
         <w:rPr>
@@ -7312,6 +7449,7 @@
     <w:p>
       <w:pPr>
         <w:pStyle w:val="Heading2"/>
+        <w:ind w:left="0" w:right="0" w:firstLine="0"/>
       </w:pPr>
       <w:r>
         <w:rPr>
@@ -7325,7 +7463,7 @@
     </w:p>
     <w:p>
       <w:pPr>
-        <w:keepNext w:val="0"/>
+        <w:pStyle w:val="ListBullet"/>
       </w:pPr>
       <w:r>
         <w:rPr>
@@ -7342,8 +7480,13 @@
           <w:color w:val="222222"/>
           <w:sz w:val="22"/>
         </w:rPr>
-        <w:t xml:space="preserve"> 企业字段契约、真实历史盲测、DFM 规则工作坊、飞书只读证据卡、模型与数据卡。 </w:t>
-      </w:r>
+        <w:t xml:space="preserve"> 企业字段契约、真实历史盲测、DFM 规则工作坊、飞书只读证据卡、模型与数据卡。</w:t>
+      </w:r>
+    </w:p>
+    <w:p>
+      <w:pPr>
+        <w:pStyle w:val="ListBullet"/>
+      </w:pPr>
       <w:r>
         <w:rPr>
           <w:rFonts w:ascii="Calibri" w:hAnsi="Calibri" w:eastAsia="Microsoft YaHei"/>
@@ -7359,8 +7502,13 @@
           <w:color w:val="222222"/>
           <w:sz w:val="22"/>
         </w:rPr>
-        <w:t xml:space="preserve"> 影子运行、校准面板外部验证、冠军/挑战者、分组监控、偏好数据质量。 </w:t>
-      </w:r>
+        <w:t xml:space="preserve"> 影子运行、校准面板外部验证、冠军/挑战者、分组监控、偏好数据质量。</w:t>
+      </w:r>
+    </w:p>
+    <w:p>
+      <w:pPr>
+        <w:pStyle w:val="ListBullet"/>
+      </w:pPr>
       <w:r>
         <w:rPr>
           <w:rFonts w:ascii="Calibri" w:hAnsi="Calibri" w:eastAsia="Microsoft YaHei"/>
@@ -7382,6 +7530,7 @@
     <w:p>
       <w:pPr>
         <w:pStyle w:val="Heading1"/>
+        <w:ind w:left="0" w:right="0" w:firstLine="0"/>
       </w:pPr>
       <w:r>
         <w:rPr>
@@ -7422,6 +7571,7 @@
     <w:p>
       <w:pPr>
         <w:pStyle w:val="Heading1"/>
+        <w:ind w:left="0" w:right="0" w:firstLine="0"/>
       </w:pPr>
       <w:r>
         <w:rPr>
@@ -8158,6 +8308,7 @@
     <w:p>
       <w:pPr>
         <w:pStyle w:val="Heading1"/>
+        <w:ind w:left="0" w:right="0" w:firstLine="0"/>
       </w:pPr>
       <w:r>
         <w:rPr>
@@ -8302,6 +8453,7 @@
     <w:p>
       <w:pPr>
         <w:pStyle w:val="Heading1"/>
+        <w:ind w:left="0" w:right="0" w:firstLine="0"/>
       </w:pPr>
       <w:r>
         <w:rPr>
@@ -8934,6 +9086,74 @@
       </w:rPr>
     </w:lvl>
   </w:abstractNum>
+  <w:abstractNum w:abstractNumId="9">
+    <w:nsid w:val="A11C0009"/>
+    <w:multiLevelType w:val="singleLevel"/>
+    <w:tmpl w:val="B17E0009"/>
+    <w:lvl w:ilvl="0">
+      <w:start w:val="1"/>
+      <w:numFmt w:val="decimal"/>
+      <w:lvlText w:val="%1."/>
+      <w:lvlJc w:val="left"/>
+      <w:pPr>
+        <w:tabs>
+          <w:tab w:val="num" w:pos="720"/>
+        </w:tabs>
+        <w:ind w:left="720" w:hanging="360"/>
+      </w:pPr>
+    </w:lvl>
+  </w:abstractNum>
+  <w:abstractNum w:abstractNumId="10">
+    <w:nsid w:val="A11C000A"/>
+    <w:multiLevelType w:val="singleLevel"/>
+    <w:tmpl w:val="B17E000A"/>
+    <w:lvl w:ilvl="0">
+      <w:start w:val="1"/>
+      <w:numFmt w:val="decimal"/>
+      <w:lvlText w:val="%1."/>
+      <w:lvlJc w:val="left"/>
+      <w:pPr>
+        <w:tabs>
+          <w:tab w:val="num" w:pos="720"/>
+        </w:tabs>
+        <w:ind w:left="720" w:hanging="360"/>
+      </w:pPr>
+    </w:lvl>
+  </w:abstractNum>
+  <w:abstractNum w:abstractNumId="11">
+    <w:nsid w:val="A11C000B"/>
+    <w:multiLevelType w:val="singleLevel"/>
+    <w:tmpl w:val="B17E000B"/>
+    <w:lvl w:ilvl="0">
+      <w:start w:val="1"/>
+      <w:numFmt w:val="decimal"/>
+      <w:lvlText w:val="%1."/>
+      <w:lvlJc w:val="left"/>
+      <w:pPr>
+        <w:tabs>
+          <w:tab w:val="num" w:pos="720"/>
+        </w:tabs>
+        <w:ind w:left="720" w:hanging="360"/>
+      </w:pPr>
+    </w:lvl>
+  </w:abstractNum>
+  <w:abstractNum w:abstractNumId="12">
+    <w:nsid w:val="A11C000C"/>
+    <w:multiLevelType w:val="singleLevel"/>
+    <w:tmpl w:val="B17E000C"/>
+    <w:lvl w:ilvl="0">
+      <w:start w:val="1"/>
+      <w:numFmt w:val="decimal"/>
+      <w:lvlText w:val="%1."/>
+      <w:lvlJc w:val="left"/>
+      <w:pPr>
+        <w:tabs>
+          <w:tab w:val="num" w:pos="720"/>
+        </w:tabs>
+        <w:ind w:left="720" w:hanging="360"/>
+      </w:pPr>
+    </w:lvl>
+  </w:abstractNum>
   <w:num w:numId="1">
     <w:abstractNumId w:val="8"/>
   </w:num>
@@ -8961,77 +9181,29 @@
   <w:num w:numId="9">
     <w:abstractNumId w:val="0"/>
   </w:num>
-  <w:abstractNum w:abstractNumId="9">
-    <w:multiLevelType w:val="singleLevel"/>
-    <w:lvl w:ilvl="0">
-      <w:start w:val="1"/>
-      <w:numFmt w:val="decimal"/>
-      <w:lvlText w:val="%1."/>
-      <w:lvlJc w:val="left"/>
-      <w:pPr>
-        <w:tabs>
-          <w:tab w:val="num" w:pos="720"/>
-        </w:tabs>
-        <w:ind w:left="720" w:hanging="360"/>
-      </w:pPr>
-    </w:lvl>
-  </w:abstractNum>
   <w:num w:numId="10">
     <w:abstractNumId w:val="9"/>
+    <w:lvlOverride w:ilvl="0">
+      <w:startOverride w:val="1"/>
+    </w:lvlOverride>
   </w:num>
-  <w:abstractNum w:abstractNumId="10">
-    <w:multiLevelType w:val="singleLevel"/>
-    <w:lvl w:ilvl="0">
-      <w:start w:val="1"/>
-      <w:numFmt w:val="decimal"/>
-      <w:lvlText w:val="%1."/>
-      <w:lvlJc w:val="left"/>
-      <w:pPr>
-        <w:tabs>
-          <w:tab w:val="num" w:pos="720"/>
-        </w:tabs>
-        <w:ind w:left="720" w:hanging="360"/>
-      </w:pPr>
-    </w:lvl>
-  </w:abstractNum>
   <w:num w:numId="11">
     <w:abstractNumId w:val="10"/>
+    <w:lvlOverride w:ilvl="0">
+      <w:startOverride w:val="1"/>
+    </w:lvlOverride>
   </w:num>
-  <w:abstractNum w:abstractNumId="11">
-    <w:multiLevelType w:val="singleLevel"/>
-    <w:lvl w:ilvl="0">
-      <w:start w:val="1"/>
-      <w:numFmt w:val="decimal"/>
-      <w:lvlText w:val="%1."/>
-      <w:lvlJc w:val="left"/>
-      <w:pPr>
-        <w:tabs>
-          <w:tab w:val="num" w:pos="720"/>
-        </w:tabs>
-        <w:ind w:left="720" w:hanging="360"/>
-      </w:pPr>
-    </w:lvl>
-  </w:abstractNum>
   <w:num w:numId="12">
     <w:abstractNumId w:val="11"/>
+    <w:lvlOverride w:ilvl="0">
+      <w:startOverride w:val="1"/>
+    </w:lvlOverride>
   </w:num>
-  <w:abstractNum w:abstractNumId="12">
-    <w:multiLevelType w:val="singleLevel"/>
-    <w:lvl w:ilvl="0">
-      <w:start w:val="1"/>
-      <w:numFmt w:val="decimal"/>
-      <w:lvlText w:val="%1."/>
-      <w:lvlJc w:val="left"/>
-      <w:pPr>
-        <w:tabs>
-          <w:tab w:val="num" w:pos="720"/>
-        </w:tabs>
-        <w:ind w:left="720" w:hanging="360"/>
-      </w:pPr>
-    </w:lvl>
-  </w:abstractNum>
   <w:num w:numId="13">
     <w:abstractNumId w:val="12"/>
+    <w:lvlOverride w:ilvl="0">
+      <w:startOverride w:val="1"/>
+    </w:lvlOverride>
   </w:num>
 </w:numbering>
 </file>

</xml_diff>

<commit_message>
docs: position project as an enterprise problem solution
</commit_message>
<xml_diff>
--- a/output/docx/AI产品开发引擎技术白皮书.docx
+++ b/output/docx/AI产品开发引擎技术白皮书.docx
@@ -39,7 +39,7 @@
           <w:color w:val="9A6A00"/>
           <w:sz w:val="20"/>
         </w:rPr>
-        <w:t>TECHNICAL WHITE PAPER · 企业级赛题评审版</w:t>
+        <w:t>TECHNICAL WHITE PAPER · 企业问题解决方案评审版</w:t>
       </w:r>
     </w:p>
     <w:p>
@@ -108,7 +108,7 @@
           <w:color w:val="667085"/>
           <w:sz w:val="20"/>
         </w:rPr>
-        <w:t>v1.1</w:t>
+        <w:t>v1.2</w:t>
       </w:r>
     </w:p>
     <w:p>
@@ -177,7 +177,7 @@
           <w:color w:val="667085"/>
           <w:sz w:val="20"/>
         </w:rPr>
-        <w:t>企业级赛题原型 · 非企业内部生产项目</w:t>
+        <w:t>面向企业真实问题的竞赛验证版解决方案</w:t>
       </w:r>
     </w:p>
     <w:p>
@@ -636,7 +636,7 @@
           <w:color w:val="222222"/>
           <w:sz w:val="22"/>
         </w:rPr>
-        <w:t>本项目由三名学生组成的参赛团队独立完成，目标是按企业级赛题和交付标准构建可验证原型，不代表名创优品内部项目或已上线系统。当前证据分为三级：核心算法与防泄漏控制已实现并通过自动化测试；端到端指标来自固定生成器的合成演示；真实爆品命中率、周期、成本和 ROI 仍需企业历史数据回放与前瞻试点验证。本文不把合成结果描述为生产业绩。</w:t>
+        <w:t>本项目由三名学生组成的参赛团队独立完成，目标是帮助企业解决高速上新场景中趋势信号难验证、创意难筛选、上市前评估不可靠和决策难复盘等真实问题，并按企业工作流和治理门槛构建竞赛验证版解决方案。它不代表名创优品内部项目或已上线系统。当前证据分为三级：核心算法与防泄漏控制已实现并通过自动化测试；端到端指标来自固定生成器的合成演示；真实爆品命中率、周期、成本和 ROI 仍需企业历史数据回放与前瞻试点验证。本文不把合成结果描述为生产业绩。</w:t>
       </w:r>
     </w:p>
     <w:p>
@@ -814,6 +814,19 @@
     </w:p>
     <w:p>
       <w:pPr>
+        <w:keepNext w:val="0"/>
+      </w:pPr>
+      <w:r>
+        <w:rPr>
+          <w:rFonts w:ascii="Calibri" w:hAnsi="Calibri" w:eastAsia="Microsoft YaHei"/>
+          <w:color w:val="222222"/>
+          <w:sz w:val="22"/>
+        </w:rPr>
+        <w:t>这些不是单一算法题，而是企业新品研发流程中的连续决策问题。本方案以“帮助企业形成更可靠、更一致、可追责的候选筛选与试点机制”为目标，不以替代产品经理、设计、供应链或消费者研究团队为目标。</w:t>
+      </w:r>
+    </w:p>
+    <w:p>
+      <w:pPr>
         <w:pStyle w:val="Heading2"/>
         <w:ind w:left="0" w:right="0" w:firstLine="0"/>
       </w:pPr>
@@ -943,7 +956,7 @@
           <w:color w:val="222222"/>
           <w:sz w:val="22"/>
         </w:rPr>
-        <w:t>以下成果由三名学生组成的参赛团队完成。表中的“企业待验证”表示需要企业数据、领域专家或真实应用环境才能继续验证，并不暗示这些条件已经具备。</w:t>
+        <w:t>以下成果构成三名学生团队当前可交付给企业验证的解决方案基线。表中的“企业待验证”表示需要企业数据、领域专家或真实应用环境才能继续验证，并不暗示这些条件已经具备。</w:t>
       </w:r>
     </w:p>
     <w:tbl>
@@ -7565,7 +7578,7 @@
           <w:color w:val="222222"/>
           <w:sz w:val="22"/>
         </w:rPr>
-        <w:t>当前仓库已经从概念骨架升级为可复现的技术基线：核心不变量有测试，合成实验有机器可读证据，夸大口径被显式隔离。下一步不是继续包装合成指标，而是与企业共同冻结标签和盲测协议，让真实数据决定系统是否值得进入影子运行。只有经过历史盲测、前瞻试点、安全和合规门禁的提升，才可以被称为业务价值。</w:t>
+        <w:t>三名学生团队的目标不是把竞赛原型包装成已上线系统，而是把企业问题转化为可验证、可接入、可治理的解决方案。当前仓库已经从概念骨架升级为可复现的技术基线：核心不变量有测试，合成实验有机器可读证据，夸大口径被显式隔离。下一步不是继续包装合成指标，而是与企业共同冻结标签和盲测协议，让真实数据决定系统是否值得进入影子运行。只有经过历史盲测、前瞻试点、安全和合规门禁的提升，才可以被称为业务价值。</w:t>
       </w:r>
     </w:p>
     <w:p>

</xml_diff>